<commit_message>
Humanize site copy, correct the model name, add two figures
The footer still credited Llama 3.3 70B; the primary model has been
openai/gpt-oss-120b since the evaluation runs. Corrected, and the server URL
dropped from the footer since it means nothing to a visitor.

Site copy rewritten to say what the system does rather than describe it in
product language: 'autonomous', 'real time' and 'Self-Healing' removed, and
the Actor-Critic card now explains why the split matters instead of quoting a
constant from the prompt. Removed the dead JS line that wrote the endpoint
note element after that element was deleted.

Report gains a comparison chart across the three runs and a per-case outcome
chart, bringing figure density closer to the format used for this course last
semester, and the caption wording matches it too.
</commit_message>
<xml_diff>
--- a/דוח סיכום עבודת גמר - מבקר הקוד הכפול.docx
+++ b/דוח סיכום עבודת גמר - מבקר הקוד הכפול.docx
@@ -333,7 +333,7 @@
           <w:b/>
           <w:rtl/>
         </w:rPr>
-        <w:t xml:space="preserve">מה רואים בנתונים: </w:t>
+        <w:t xml:space="preserve">מה רואים בגרף: </w:t>
       </w:r>
       <w:r>
         <w:rPr>
@@ -460,7 +460,7 @@
           <w:b/>
           <w:rtl/>
         </w:rPr>
-        <w:t xml:space="preserve">מה רואים בנתונים: </w:t>
+        <w:t xml:space="preserve">מה רואים בגרף: </w:t>
       </w:r>
       <w:r>
         <w:rPr>
@@ -1866,6 +1866,58 @@
     <w:p/>
     <w:p>
       <w:pPr>
+        <w:jc w:val="center"/>
+      </w:pPr>
+      <w:r>
+        <w:drawing>
+          <wp:inline xmlns:a="http://schemas.openxmlformats.org/drawingml/2006/main" xmlns:pic="http://schemas.openxmlformats.org/drawingml/2006/picture">
+            <wp:extent cx="5394960" cy="2513366"/>
+            <wp:docPr id="5" name="Picture 5"/>
+            <wp:cNvGraphicFramePr>
+              <a:graphicFrameLocks noChangeAspect="1"/>
+            </wp:cNvGraphicFramePr>
+            <a:graphic>
+              <a:graphicData uri="http://schemas.openxmlformats.org/drawingml/2006/picture">
+                <pic:pic>
+                  <pic:nvPicPr>
+                    <pic:cNvPr id="0" name="fig5_run_comparison.png"/>
+                    <pic:cNvPicPr/>
+                  </pic:nvPicPr>
+                  <pic:blipFill>
+                    <a:blip r:embed="rId13"/>
+                    <a:stretch>
+                      <a:fillRect/>
+                    </a:stretch>
+                  </pic:blipFill>
+                  <pic:spPr>
+                    <a:xfrm>
+                      <a:off x="0" y="0"/>
+                      <a:ext cx="5394960" cy="2513366"/>
+                    </a:xfrm>
+                    <a:prstGeom prst="rect"/>
+                  </pic:spPr>
+                </pic:pic>
+              </a:graphicData>
+            </a:graphic>
+          </wp:inline>
+        </w:drawing>
+      </w:r>
+    </w:p>
+    <w:p>
+      <w:pPr>
+        <w:spacing w:after="120" w:line="276" w:lineRule="auto"/>
+        <w:jc w:val="right"/>
+      </w:pPr>
+      <w:r>
+        <w:rPr>
+          <w:i/>
+          <w:rtl/>
+        </w:rPr>
+        <w:t>תרשים 5: השפעת כל תיקון בהנחיה על שלושת המדדים, באותו קורפוס ואותו מודל.</w:t>
+      </w:r>
+    </w:p>
+    <w:p>
+      <w:pPr>
         <w:spacing w:after="120" w:line="276" w:lineRule="auto"/>
         <w:jc w:val="right"/>
       </w:pPr>
@@ -1977,6 +2029,58 @@
           <w:rtl/>
         </w:rPr>
         <w:t>הטעויות שנותרו</w:t>
+      </w:r>
+    </w:p>
+    <w:p>
+      <w:pPr>
+        <w:jc w:val="center"/>
+      </w:pPr>
+      <w:r>
+        <w:drawing>
+          <wp:inline xmlns:a="http://schemas.openxmlformats.org/drawingml/2006/main" xmlns:pic="http://schemas.openxmlformats.org/drawingml/2006/picture">
+            <wp:extent cx="5394960" cy="1758357"/>
+            <wp:docPr id="6" name="Picture 6"/>
+            <wp:cNvGraphicFramePr>
+              <a:graphicFrameLocks noChangeAspect="1"/>
+            </wp:cNvGraphicFramePr>
+            <a:graphic>
+              <a:graphicData uri="http://schemas.openxmlformats.org/drawingml/2006/picture">
+                <pic:pic>
+                  <pic:nvPicPr>
+                    <pic:cNvPr id="0" name="fig6_per_case.png"/>
+                    <pic:cNvPicPr/>
+                  </pic:nvPicPr>
+                  <pic:blipFill>
+                    <a:blip r:embed="rId14"/>
+                    <a:stretch>
+                      <a:fillRect/>
+                    </a:stretch>
+                  </pic:blipFill>
+                  <pic:spPr>
+                    <a:xfrm>
+                      <a:off x="0" y="0"/>
+                      <a:ext cx="5394960" cy="1758357"/>
+                    </a:xfrm>
+                    <a:prstGeom prst="rect"/>
+                  </pic:spPr>
+                </pic:pic>
+              </a:graphicData>
+            </a:graphic>
+          </wp:inline>
+        </w:drawing>
+      </w:r>
+    </w:p>
+    <w:p>
+      <w:pPr>
+        <w:spacing w:after="120" w:line="276" w:lineRule="auto"/>
+        <w:jc w:val="right"/>
+      </w:pPr>
+      <w:r>
+        <w:rPr>
+          <w:i/>
+          <w:rtl/>
+        </w:rPr>
+        <w:t>תרשים 6: תוצאה לכל אחד מ-20 מקרי הבדיקה. FP מסמן התראת שווא.</w:t>
       </w:r>
     </w:p>
     <w:tbl>

</xml_diff>